<commit_message>
Revise Caregiver Training Program proposal per requested edits
- Replace "Special Educators" with "Psychologists" throughout (EN + AR)
- Remove the specific age range from the Target Audience section
- Rework Section 6 into a Training Duration, Schedule & Methodology
  section: 5 hours/day, 5 days/week, 2h with the Occupational
  Therapist and 3h with the multidisciplinary team, with a new
  daily-schedule table
- Remove the former Required Materials, Attendance Requirements,
  Evaluation Methods, and Certificate Requirements sections and
  renumber the remaining sections consecutively (1-7)
- Rewrite the Conclusion to reflect only the remaining sections
- Standardize the author name as "Saja Al-Zyoud (سجى الزيود)" /
  "سجى الزيود (Saja Al-Zyoud)" everywhere it appears
- Proofread both language versions for consistency
</commit_message>
<xml_diff>
--- a/Caregiver Training Program Proposal/Kalm-Clinic-Caregiver-Training-Program-Proposal-AR.docx
+++ b/Caregiver Training Program Proposal/Kalm-Clinic-Caregiver-Training-Program-Proposal-AR.docx
@@ -144,7 +144,7 @@
           <w:szCs w:val="22"/>
           <w:rtl/>
         </w:rPr>
-        <w:t xml:space="preserve">ساجا الزيود</w:t>
+        <w:t xml:space="preserve">سجى الزيود (Saja Al-Zyoud)</w:t>
       </w:r>
     </w:p>
     <w:p>
@@ -256,7 +256,7 @@
           <w:szCs w:val="21"/>
           <w:rtl/>
         </w:rPr>
-        <w:t xml:space="preserve">يقدّم هذا المستند برنامجًا تدريبيًا عمليًا مصممًا لتزويد مقدمي الرعاية بالمعرفة والمهارات التي يحتاجونها لدعم أطفالهم بثقة وفعالية أكبر. وقد بُني هذا البرنامج على خبرتي كأخصائية علاج وظيفي ضمن فريق عيادة كالم متعدد التخصصات، بالتعاون مع أخصائيي العلاج الطبيعي والنطق والتربية الخاصة.</w:t>
+        <w:t xml:space="preserve">يقدّم هذا المستند برنامجًا تدريبيًا عمليًا مصممًا لتزويد مقدمي الرعاية بالمعرفة والمهارات التي يحتاجونها لدعم أطفالهم بثقة وفعالية أكبر. وقد بُني هذا البرنامج على خبرتي كأخصائية علاج وظيفي ضمن فريق عيادة كالم متعدد التخصصات، بالتعاون مع أخصائيي العلاج الطبيعي والنطق وأخصائيي علم النفس.</w:t>
       </w:r>
     </w:p>
     <w:p>
@@ -331,7 +331,7 @@
           <w:szCs w:val="21"/>
           <w:rtl/>
         </w:rPr>
-        <w:t xml:space="preserve">ورغم أن البرنامج يقوده قسم العلاج الوظيفي، إلا أنه يعكس النهج متعدد التخصصات الذي تتبناه عيادة كالم؛ إذ تتضمن بعض الجلسات مشاركات ضيوف من العلاج الطبيعي وعلاج النطق واللغة والتربية الخاصة، ليخرج مقدم الرعاية بفهم شامل لفريق طفله العلاجي ودور كل تخصص فيه.</w:t>
+        <w:t xml:space="preserve">ورغم أن البرنامج يقوده قسم العلاج الوظيفي، إلا أنه يعكس النهج متعدد التخصصات الذي تتبناه عيادة كالم؛ إذ يتضمن كل يوم تدريبي مشاركة من العلاج الطبيعي وعلاج النطق واللغة وعلم النفس، ليخرج مقدم الرعاية بفهم شامل لفريق طفله العلاجي ودور كل تخصص فيه.</w:t>
       </w:r>
     </w:p>
     <w:p>
@@ -638,7 +638,7 @@
           <w:szCs w:val="21"/>
           <w:rtl/>
         </w:rPr>
-        <w:t xml:space="preserve">أهل وأولياء أمور الأطفال ذوي الإعاقة (من عمر 0 إلى 12 سنة).</w:t>
+        <w:t xml:space="preserve">أهل وأولياء أمور الأطفال ذوي الإعاقة.</w:t>
       </w:r>
     </w:p>
     <w:p>
@@ -1028,8 +1028,517 @@
           <w:szCs w:val="30"/>
           <w:rtl/>
         </w:rPr>
-        <w:t xml:space="preserve">٦. منهجية التدريب</w:t>
+        <w:t xml:space="preserve">٦. مدة التدريب وجدوله ومنهجيته</w:t>
       </w:r>
+    </w:p>
+    <w:p>
+      <w:pPr>
+        <w:bidi/>
+        <w:spacing w:after="160" w:line="300"/>
+        <w:jc w:val="both"/>
+      </w:pPr>
+      <w:r>
+        <w:rPr>
+          <w:rFonts w:ascii="Arial" w:cs="Arial" w:eastAsia="Arial" w:hAnsi="Arial"/>
+          <w:color w:val="222222"/>
+          <w:sz w:val="21"/>
+          <w:szCs w:val="21"/>
+          <w:rtl/>
+        </w:rPr>
+        <w:t xml:space="preserve">يُقام البرنامج على مدار خمسة أيام تدريب أسبوعيًا، بواقع خمس ساعات تدريب يوميًا، ولمدة اثني عشر أسبوعًا بالكامل. ويُقسَّم كل يوم تدريبي إلى جزأين متكاملين: ساعتان مع أخصائية العلاج الوظيفي، تركّزان على الموضوع الأساسي لذلك الأسبوع، وثلاث ساعات مع بقية الفريق متعدد التخصصات — العلاج الطبيعي، وعلاج النطق واللغة، وعلم النفس — لتعزيز الموضوع نفسه من زاوية كل تخصص. وبذلك يكتمل اليوم التدريبي دائمًا بساعاته الخمس كاملةً.</w:t>
+      </w:r>
+    </w:p>
+    <w:tbl>
+      <w:tblPr>
+        <w:tblW w:type="dxa" w:w="10106"/>
+        <w:tblBorders>
+          <w:top w:val="single" w:color="auto" w:sz="4"/>
+          <w:left w:val="single" w:color="auto" w:sz="4"/>
+          <w:bottom w:val="single" w:color="auto" w:sz="4"/>
+          <w:right w:val="single" w:color="auto" w:sz="4"/>
+          <w:insideH w:val="single" w:color="auto" w:sz="4"/>
+          <w:insideV w:val="single" w:color="auto" w:sz="4"/>
+        </w:tblBorders>
+      </w:tblPr>
+      <w:tblGrid>
+        <w:gridCol w:w="3306"/>
+        <w:gridCol w:w="6800"/>
+      </w:tblGrid>
+      <w:tr>
+        <w:trPr>
+          <w:cantSplit/>
+          <w:tblHeader/>
+        </w:trPr>
+        <w:tc>
+          <w:tcPr>
+            <w:tcW w:type="dxa" w:w="3306"/>
+            <w:tcBorders>
+              <w:top w:val="single" w:color="BFD3D1" w:sz="4"/>
+              <w:left w:val="single" w:color="BFD3D1" w:sz="4"/>
+              <w:bottom w:val="single" w:color="BFD3D1" w:sz="4"/>
+              <w:right w:val="single" w:color="BFD3D1" w:sz="4"/>
+            </w:tcBorders>
+            <w:shd w:fill="2E6B66" w:color="auto" w:val="clear"/>
+            <w:tcMar>
+              <w:top w:type="dxa" w:w="100"/>
+              <w:left w:type="dxa" w:w="140"/>
+              <w:bottom w:type="dxa" w:w="100"/>
+              <w:right w:type="dxa" w:w="140"/>
+            </w:tcMar>
+            <w:vAlign w:val="center"/>
+          </w:tcPr>
+          <w:p>
+            <w:pPr>
+              <w:bidi/>
+              <w:jc w:val="right"/>
+            </w:pPr>
+            <w:r>
+              <w:rPr>
+                <w:rFonts w:ascii="Arial" w:cs="Arial" w:eastAsia="Arial" w:hAnsi="Arial"/>
+                <w:b/>
+                <w:bCs/>
+                <w:color w:val="FFFFFF"/>
+                <w:sz w:val="20"/>
+                <w:szCs w:val="20"/>
+                <w:rtl/>
+              </w:rPr>
+              <w:t xml:space="preserve">التفاصيل</w:t>
+            </w:r>
+          </w:p>
+        </w:tc>
+        <w:tc>
+          <w:tcPr>
+            <w:tcW w:type="dxa" w:w="6800"/>
+            <w:tcBorders>
+              <w:top w:val="single" w:color="BFD3D1" w:sz="4"/>
+              <w:left w:val="single" w:color="BFD3D1" w:sz="4"/>
+              <w:bottom w:val="single" w:color="BFD3D1" w:sz="4"/>
+              <w:right w:val="single" w:color="BFD3D1" w:sz="4"/>
+            </w:tcBorders>
+            <w:shd w:fill="2E6B66" w:color="auto" w:val="clear"/>
+            <w:tcMar>
+              <w:top w:type="dxa" w:w="100"/>
+              <w:left w:type="dxa" w:w="140"/>
+              <w:bottom w:type="dxa" w:w="100"/>
+              <w:right w:type="dxa" w:w="140"/>
+            </w:tcMar>
+            <w:vAlign w:val="center"/>
+          </w:tcPr>
+          <w:p>
+            <w:pPr>
+              <w:bidi/>
+              <w:jc w:val="right"/>
+            </w:pPr>
+            <w:r>
+              <w:rPr>
+                <w:rFonts w:ascii="Arial" w:cs="Arial" w:eastAsia="Arial" w:hAnsi="Arial"/>
+                <w:b/>
+                <w:bCs/>
+                <w:color w:val="FFFFFF"/>
+                <w:sz w:val="20"/>
+                <w:szCs w:val="20"/>
+                <w:rtl/>
+              </w:rPr>
+              <w:t xml:space="preserve">العنصر</w:t>
+            </w:r>
+          </w:p>
+        </w:tc>
+      </w:tr>
+      <w:tr>
+        <w:trPr>
+          <w:cantSplit/>
+        </w:trPr>
+        <w:tc>
+          <w:tcPr>
+            <w:tcW w:type="dxa" w:w="3306"/>
+            <w:tcBorders>
+              <w:top w:val="single" w:color="BFD3D1" w:sz="4"/>
+              <w:left w:val="single" w:color="BFD3D1" w:sz="4"/>
+              <w:bottom w:val="single" w:color="BFD3D1" w:sz="4"/>
+              <w:right w:val="single" w:color="BFD3D1" w:sz="4"/>
+            </w:tcBorders>
+            <w:tcMar>
+              <w:top w:type="dxa" w:w="100"/>
+              <w:left w:type="dxa" w:w="140"/>
+              <w:bottom w:type="dxa" w:w="100"/>
+              <w:right w:type="dxa" w:w="140"/>
+            </w:tcMar>
+            <w:vAlign w:val="center"/>
+          </w:tcPr>
+          <w:p>
+            <w:pPr>
+              <w:bidi/>
+              <w:jc w:val="right"/>
+            </w:pPr>
+            <w:r>
+              <w:rPr>
+                <w:rFonts w:ascii="Arial" w:cs="Arial" w:eastAsia="Arial" w:hAnsi="Arial"/>
+                <w:b w:val="false"/>
+                <w:bCs w:val="false"/>
+                <w:color w:val="222222"/>
+                <w:sz w:val="19"/>
+                <w:szCs w:val="19"/>
+                <w:rtl/>
+              </w:rPr>
+              <w:t xml:space="preserve">5 أيام</w:t>
+            </w:r>
+          </w:p>
+        </w:tc>
+        <w:tc>
+          <w:tcPr>
+            <w:tcW w:type="dxa" w:w="6800"/>
+            <w:tcBorders>
+              <w:top w:val="single" w:color="BFD3D1" w:sz="4"/>
+              <w:left w:val="single" w:color="BFD3D1" w:sz="4"/>
+              <w:bottom w:val="single" w:color="BFD3D1" w:sz="4"/>
+              <w:right w:val="single" w:color="BFD3D1" w:sz="4"/>
+            </w:tcBorders>
+            <w:shd w:fill="E7F0EF" w:color="auto" w:val="clear"/>
+            <w:tcMar>
+              <w:top w:type="dxa" w:w="100"/>
+              <w:left w:type="dxa" w:w="140"/>
+              <w:bottom w:type="dxa" w:w="100"/>
+              <w:right w:type="dxa" w:w="140"/>
+            </w:tcMar>
+            <w:vAlign w:val="center"/>
+          </w:tcPr>
+          <w:p>
+            <w:pPr>
+              <w:bidi/>
+              <w:jc w:val="right"/>
+            </w:pPr>
+            <w:r>
+              <w:rPr>
+                <w:rFonts w:ascii="Arial" w:cs="Arial" w:eastAsia="Arial" w:hAnsi="Arial"/>
+                <w:b/>
+                <w:bCs/>
+                <w:color w:val="1F4A47"/>
+                <w:sz w:val="19"/>
+                <w:szCs w:val="19"/>
+                <w:rtl/>
+              </w:rPr>
+              <w:t xml:space="preserve">أيام التدريب أسبوعيًا</w:t>
+            </w:r>
+          </w:p>
+        </w:tc>
+      </w:tr>
+      <w:tr>
+        <w:trPr>
+          <w:cantSplit/>
+        </w:trPr>
+        <w:tc>
+          <w:tcPr>
+            <w:tcW w:type="dxa" w:w="3306"/>
+            <w:tcBorders>
+              <w:top w:val="single" w:color="BFD3D1" w:sz="4"/>
+              <w:left w:val="single" w:color="BFD3D1" w:sz="4"/>
+              <w:bottom w:val="single" w:color="BFD3D1" w:sz="4"/>
+              <w:right w:val="single" w:color="BFD3D1" w:sz="4"/>
+            </w:tcBorders>
+            <w:tcMar>
+              <w:top w:type="dxa" w:w="100"/>
+              <w:left w:type="dxa" w:w="140"/>
+              <w:bottom w:type="dxa" w:w="100"/>
+              <w:right w:type="dxa" w:w="140"/>
+            </w:tcMar>
+            <w:vAlign w:val="center"/>
+          </w:tcPr>
+          <w:p>
+            <w:pPr>
+              <w:bidi/>
+              <w:jc w:val="right"/>
+            </w:pPr>
+            <w:r>
+              <w:rPr>
+                <w:rFonts w:ascii="Arial" w:cs="Arial" w:eastAsia="Arial" w:hAnsi="Arial"/>
+                <w:b w:val="false"/>
+                <w:bCs w:val="false"/>
+                <w:color w:val="222222"/>
+                <w:sz w:val="19"/>
+                <w:szCs w:val="19"/>
+                <w:rtl/>
+              </w:rPr>
+              <w:t xml:space="preserve">12 أسبوعًا</w:t>
+            </w:r>
+          </w:p>
+        </w:tc>
+        <w:tc>
+          <w:tcPr>
+            <w:tcW w:type="dxa" w:w="6800"/>
+            <w:tcBorders>
+              <w:top w:val="single" w:color="BFD3D1" w:sz="4"/>
+              <w:left w:val="single" w:color="BFD3D1" w:sz="4"/>
+              <w:bottom w:val="single" w:color="BFD3D1" w:sz="4"/>
+              <w:right w:val="single" w:color="BFD3D1" w:sz="4"/>
+            </w:tcBorders>
+            <w:shd w:fill="E7F0EF" w:color="auto" w:val="clear"/>
+            <w:tcMar>
+              <w:top w:type="dxa" w:w="100"/>
+              <w:left w:type="dxa" w:w="140"/>
+              <w:bottom w:type="dxa" w:w="100"/>
+              <w:right w:type="dxa" w:w="140"/>
+            </w:tcMar>
+            <w:vAlign w:val="center"/>
+          </w:tcPr>
+          <w:p>
+            <w:pPr>
+              <w:bidi/>
+              <w:jc w:val="right"/>
+            </w:pPr>
+            <w:r>
+              <w:rPr>
+                <w:rFonts w:ascii="Arial" w:cs="Arial" w:eastAsia="Arial" w:hAnsi="Arial"/>
+                <w:b/>
+                <w:bCs/>
+                <w:color w:val="1F4A47"/>
+                <w:sz w:val="19"/>
+                <w:szCs w:val="19"/>
+                <w:rtl/>
+              </w:rPr>
+              <w:t xml:space="preserve">مدة البرنامج</w:t>
+            </w:r>
+          </w:p>
+        </w:tc>
+      </w:tr>
+      <w:tr>
+        <w:trPr>
+          <w:cantSplit/>
+        </w:trPr>
+        <w:tc>
+          <w:tcPr>
+            <w:tcW w:type="dxa" w:w="3306"/>
+            <w:tcBorders>
+              <w:top w:val="single" w:color="BFD3D1" w:sz="4"/>
+              <w:left w:val="single" w:color="BFD3D1" w:sz="4"/>
+              <w:bottom w:val="single" w:color="BFD3D1" w:sz="4"/>
+              <w:right w:val="single" w:color="BFD3D1" w:sz="4"/>
+            </w:tcBorders>
+            <w:tcMar>
+              <w:top w:type="dxa" w:w="100"/>
+              <w:left w:type="dxa" w:w="140"/>
+              <w:bottom w:type="dxa" w:w="100"/>
+              <w:right w:type="dxa" w:w="140"/>
+            </w:tcMar>
+            <w:vAlign w:val="center"/>
+          </w:tcPr>
+          <w:p>
+            <w:pPr>
+              <w:bidi/>
+              <w:jc w:val="right"/>
+            </w:pPr>
+            <w:r>
+              <w:rPr>
+                <w:rFonts w:ascii="Arial" w:cs="Arial" w:eastAsia="Arial" w:hAnsi="Arial"/>
+                <w:b w:val="false"/>
+                <w:bCs w:val="false"/>
+                <w:color w:val="222222"/>
+                <w:sz w:val="19"/>
+                <w:szCs w:val="19"/>
+                <w:rtl/>
+              </w:rPr>
+              <w:t xml:space="preserve">ساعتان يوميًا</w:t>
+            </w:r>
+          </w:p>
+        </w:tc>
+        <w:tc>
+          <w:tcPr>
+            <w:tcW w:type="dxa" w:w="6800"/>
+            <w:tcBorders>
+              <w:top w:val="single" w:color="BFD3D1" w:sz="4"/>
+              <w:left w:val="single" w:color="BFD3D1" w:sz="4"/>
+              <w:bottom w:val="single" w:color="BFD3D1" w:sz="4"/>
+              <w:right w:val="single" w:color="BFD3D1" w:sz="4"/>
+            </w:tcBorders>
+            <w:shd w:fill="E7F0EF" w:color="auto" w:val="clear"/>
+            <w:tcMar>
+              <w:top w:type="dxa" w:w="100"/>
+              <w:left w:type="dxa" w:w="140"/>
+              <w:bottom w:type="dxa" w:w="100"/>
+              <w:right w:type="dxa" w:w="140"/>
+            </w:tcMar>
+            <w:vAlign w:val="center"/>
+          </w:tcPr>
+          <w:p>
+            <w:pPr>
+              <w:bidi/>
+              <w:jc w:val="right"/>
+            </w:pPr>
+            <w:r>
+              <w:rPr>
+                <w:rFonts w:ascii="Arial" w:cs="Arial" w:eastAsia="Arial" w:hAnsi="Arial"/>
+                <w:b/>
+                <w:bCs/>
+                <w:color w:val="1F4A47"/>
+                <w:sz w:val="19"/>
+                <w:szCs w:val="19"/>
+                <w:rtl/>
+              </w:rPr>
+              <w:t xml:space="preserve">جلسة العلاج الوظيفي</w:t>
+            </w:r>
+          </w:p>
+        </w:tc>
+      </w:tr>
+      <w:tr>
+        <w:trPr>
+          <w:cantSplit/>
+        </w:trPr>
+        <w:tc>
+          <w:tcPr>
+            <w:tcW w:type="dxa" w:w="3306"/>
+            <w:tcBorders>
+              <w:top w:val="single" w:color="BFD3D1" w:sz="4"/>
+              <w:left w:val="single" w:color="BFD3D1" w:sz="4"/>
+              <w:bottom w:val="single" w:color="BFD3D1" w:sz="4"/>
+              <w:right w:val="single" w:color="BFD3D1" w:sz="4"/>
+            </w:tcBorders>
+            <w:tcMar>
+              <w:top w:type="dxa" w:w="100"/>
+              <w:left w:type="dxa" w:w="140"/>
+              <w:bottom w:type="dxa" w:w="100"/>
+              <w:right w:type="dxa" w:w="140"/>
+            </w:tcMar>
+            <w:vAlign w:val="center"/>
+          </w:tcPr>
+          <w:p>
+            <w:pPr>
+              <w:bidi/>
+              <w:jc w:val="right"/>
+            </w:pPr>
+            <w:r>
+              <w:rPr>
+                <w:rFonts w:ascii="Arial" w:cs="Arial" w:eastAsia="Arial" w:hAnsi="Arial"/>
+                <w:b w:val="false"/>
+                <w:bCs w:val="false"/>
+                <w:color w:val="222222"/>
+                <w:sz w:val="19"/>
+                <w:szCs w:val="19"/>
+                <w:rtl/>
+              </w:rPr>
+              <w:t xml:space="preserve">ثلاث ساعات يوميًا</w:t>
+            </w:r>
+          </w:p>
+        </w:tc>
+        <w:tc>
+          <w:tcPr>
+            <w:tcW w:type="dxa" w:w="6800"/>
+            <w:tcBorders>
+              <w:top w:val="single" w:color="BFD3D1" w:sz="4"/>
+              <w:left w:val="single" w:color="BFD3D1" w:sz="4"/>
+              <w:bottom w:val="single" w:color="BFD3D1" w:sz="4"/>
+              <w:right w:val="single" w:color="BFD3D1" w:sz="4"/>
+            </w:tcBorders>
+            <w:shd w:fill="E7F0EF" w:color="auto" w:val="clear"/>
+            <w:tcMar>
+              <w:top w:type="dxa" w:w="100"/>
+              <w:left w:type="dxa" w:w="140"/>
+              <w:bottom w:type="dxa" w:w="100"/>
+              <w:right w:type="dxa" w:w="140"/>
+            </w:tcMar>
+            <w:vAlign w:val="center"/>
+          </w:tcPr>
+          <w:p>
+            <w:pPr>
+              <w:bidi/>
+              <w:jc w:val="right"/>
+            </w:pPr>
+            <w:r>
+              <w:rPr>
+                <w:rFonts w:ascii="Arial" w:cs="Arial" w:eastAsia="Arial" w:hAnsi="Arial"/>
+                <w:b/>
+                <w:bCs/>
+                <w:color w:val="1F4A47"/>
+                <w:sz w:val="19"/>
+                <w:szCs w:val="19"/>
+                <w:rtl/>
+              </w:rPr>
+              <w:t xml:space="preserve">جلسات الفريق متعدد التخصصات (العلاج الطبيعي، علاج النطق واللغة، علم النفس)</w:t>
+            </w:r>
+          </w:p>
+        </w:tc>
+      </w:tr>
+      <w:tr>
+        <w:trPr>
+          <w:cantSplit/>
+        </w:trPr>
+        <w:tc>
+          <w:tcPr>
+            <w:tcW w:type="dxa" w:w="3306"/>
+            <w:tcBorders>
+              <w:top w:val="single" w:color="BFD3D1" w:sz="4"/>
+              <w:left w:val="single" w:color="BFD3D1" w:sz="4"/>
+              <w:bottom w:val="single" w:color="BFD3D1" w:sz="4"/>
+              <w:right w:val="single" w:color="BFD3D1" w:sz="4"/>
+            </w:tcBorders>
+            <w:tcMar>
+              <w:top w:type="dxa" w:w="100"/>
+              <w:left w:type="dxa" w:w="140"/>
+              <w:bottom w:type="dxa" w:w="100"/>
+              <w:right w:type="dxa" w:w="140"/>
+            </w:tcMar>
+            <w:vAlign w:val="center"/>
+          </w:tcPr>
+          <w:p>
+            <w:pPr>
+              <w:bidi/>
+              <w:jc w:val="right"/>
+            </w:pPr>
+            <w:r>
+              <w:rPr>
+                <w:rFonts w:ascii="Arial" w:cs="Arial" w:eastAsia="Arial" w:hAnsi="Arial"/>
+                <w:b w:val="false"/>
+                <w:bCs w:val="false"/>
+                <w:color w:val="222222"/>
+                <w:sz w:val="19"/>
+                <w:szCs w:val="19"/>
+                <w:rtl/>
+              </w:rPr>
+              <w:t xml:space="preserve">خمس ساعات يوميًا</w:t>
+            </w:r>
+          </w:p>
+        </w:tc>
+        <w:tc>
+          <w:tcPr>
+            <w:tcW w:type="dxa" w:w="6800"/>
+            <w:tcBorders>
+              <w:top w:val="single" w:color="BFD3D1" w:sz="4"/>
+              <w:left w:val="single" w:color="BFD3D1" w:sz="4"/>
+              <w:bottom w:val="single" w:color="BFD3D1" w:sz="4"/>
+              <w:right w:val="single" w:color="BFD3D1" w:sz="4"/>
+            </w:tcBorders>
+            <w:shd w:fill="E7F0EF" w:color="auto" w:val="clear"/>
+            <w:tcMar>
+              <w:top w:type="dxa" w:w="100"/>
+              <w:left w:type="dxa" w:w="140"/>
+              <w:bottom w:type="dxa" w:w="100"/>
+              <w:right w:type="dxa" w:w="140"/>
+            </w:tcMar>
+            <w:vAlign w:val="center"/>
+          </w:tcPr>
+          <w:p>
+            <w:pPr>
+              <w:bidi/>
+              <w:jc w:val="right"/>
+            </w:pPr>
+            <w:r>
+              <w:rPr>
+                <w:rFonts w:ascii="Arial" w:cs="Arial" w:eastAsia="Arial" w:hAnsi="Arial"/>
+                <w:b/>
+                <w:bCs/>
+                <w:color w:val="1F4A47"/>
+                <w:sz w:val="19"/>
+                <w:szCs w:val="19"/>
+                <w:rtl/>
+              </w:rPr>
+              <w:t xml:space="preserve">إجمالي ساعات التدريب اليومية</w:t>
+            </w:r>
+          </w:p>
+        </w:tc>
+      </w:tr>
+    </w:tbl>
+    <w:p>
+      <w:pPr>
+        <w:spacing w:after="200"/>
+      </w:pPr>
     </w:p>
     <w:p>
       <w:pPr>
@@ -1050,29 +1559,7 @@
           <w:szCs w:val="21"/>
           <w:rtl/>
         </w:rPr>
-        <w:t xml:space="preserve">جلسات أسبوعية حضورية، بواقع ساعتين أسبوعيًا لمدة 12 أسبوعًا.</w:t>
-      </w:r>
-    </w:p>
-    <w:p>
-      <w:pPr>
-        <w:pStyle w:val="ListParagraph"/>
-        <w:numPr>
-          <w:ilvl w:val="0"/>
-          <w:numId w:val="2"/>
-        </w:numPr>
-        <w:bidi/>
-        <w:spacing w:after="60"/>
-        <w:jc w:val="right"/>
-      </w:pPr>
-      <w:r>
-        <w:rPr>
-          <w:rFonts w:ascii="Arial" w:cs="Arial" w:eastAsia="Arial" w:hAnsi="Arial"/>
-          <w:color w:val="222222"/>
-          <w:sz w:val="21"/>
-          <w:szCs w:val="21"/>
-          <w:rtl/>
-        </w:rPr>
-        <w:t xml:space="preserve">مزيج بين جزء نظري مختصر (نحو 20%) وتطبيق عملي (نحو 80%).</w:t>
+        <w:t xml:space="preserve">مزيج بين جزء نظري مختصر (نحو 20%) وتطبيق عملي (نحو 80%) على مدار اليوم التدريبي.</w:t>
       </w:r>
     </w:p>
     <w:p>
@@ -1160,7 +1647,7 @@
           <w:szCs w:val="21"/>
           <w:rtl/>
         </w:rPr>
-        <w:t xml:space="preserve">توزيع نشرات أسبوعية وأوراق تدريب منزلي مبسّطة.</w:t>
+        <w:t xml:space="preserve">نشرات يومية وأوراق تدريب منزلي مبسّطة.</w:t>
       </w:r>
     </w:p>
     <w:p>
@@ -1182,7 +1669,7 @@
           <w:szCs w:val="21"/>
           <w:rtl/>
         </w:rPr>
-        <w:t xml:space="preserve">نقاش مفتوح وأسئلة في نهاية كل جلسة.</w:t>
+        <w:t xml:space="preserve">نقاش مفتوح وأسئلة في نهاية كل يوم تدريبي.</w:t>
       </w:r>
     </w:p>
     <w:p>
@@ -1204,29 +1691,7 @@
           <w:szCs w:val="21"/>
           <w:rtl/>
         </w:rPr>
-        <w:t xml:space="preserve">جلسات ضيوف من العلاج الطبيعي وعلاج النطق والتربية الخاصة.</w:t>
-      </w:r>
-    </w:p>
-    <w:p>
-      <w:pPr>
-        <w:pStyle w:val="ListParagraph"/>
-        <w:numPr>
-          <w:ilvl w:val="0"/>
-          <w:numId w:val="2"/>
-        </w:numPr>
-        <w:bidi/>
-        <w:spacing w:after="60"/>
-        <w:jc w:val="right"/>
-      </w:pPr>
-      <w:r>
-        <w:rPr>
-          <w:rFonts w:ascii="Arial" w:cs="Arial" w:eastAsia="Arial" w:hAnsi="Arial"/>
-          <w:color w:val="222222"/>
-          <w:sz w:val="21"/>
-          <w:szCs w:val="21"/>
-          <w:rtl/>
-        </w:rPr>
-        <w:t xml:space="preserve">مجموعة تواصل (واتساب) للإجابة عن الاستفسارات السريعة بين الجلسات.</w:t>
+        <w:t xml:space="preserve">مجموعة تواصل (واتساب) للإجابة عن الاستفسارات السريعة بين أيام التدريب.</w:t>
       </w:r>
     </w:p>
     <w:p>
@@ -1250,603 +1715,7 @@
           <w:szCs w:val="30"/>
           <w:rtl/>
         </w:rPr>
-        <w:t xml:space="preserve">٧. المواد والأدوات المطلوبة</w:t>
-      </w:r>
-    </w:p>
-    <w:p>
-      <w:pPr>
-        <w:keepNext/>
-        <w:bidi/>
-        <w:spacing w:after="100" w:before="200"/>
-        <w:jc w:val="right"/>
-      </w:pPr>
-      <w:r>
-        <w:rPr>
-          <w:rFonts w:ascii="Arial" w:cs="Arial" w:eastAsia="Arial" w:hAnsi="Arial"/>
-          <w:b/>
-          <w:bCs/>
-          <w:color w:val="1F4A47"/>
-          <w:sz w:val="22"/>
-          <w:szCs w:val="22"/>
-          <w:rtl/>
-        </w:rPr>
-        <w:t xml:space="preserve">تجهيزات تقدمها العيادة:</w:t>
-      </w:r>
-    </w:p>
-    <w:p>
-      <w:pPr>
-        <w:pStyle w:val="ListParagraph"/>
-        <w:numPr>
-          <w:ilvl w:val="0"/>
-          <w:numId w:val="2"/>
-        </w:numPr>
-        <w:bidi/>
-        <w:spacing w:after="60"/>
-        <w:jc w:val="right"/>
-      </w:pPr>
-      <w:r>
-        <w:rPr>
-          <w:rFonts w:ascii="Arial" w:cs="Arial" w:eastAsia="Arial" w:hAnsi="Arial"/>
-          <w:color w:val="222222"/>
-          <w:sz w:val="21"/>
-          <w:szCs w:val="21"/>
-          <w:rtl/>
-        </w:rPr>
-        <w:t xml:space="preserve">قاعة تدريب مزوّدة بأرضية أو حصائر مناسبة للتدريب على الأرض.</w:t>
-      </w:r>
-    </w:p>
-    <w:p>
-      <w:pPr>
-        <w:pStyle w:val="ListParagraph"/>
-        <w:numPr>
-          <w:ilvl w:val="0"/>
-          <w:numId w:val="2"/>
-        </w:numPr>
-        <w:bidi/>
-        <w:spacing w:after="60"/>
-        <w:jc w:val="right"/>
-      </w:pPr>
-      <w:r>
-        <w:rPr>
-          <w:rFonts w:ascii="Arial" w:cs="Arial" w:eastAsia="Arial" w:hAnsi="Arial"/>
-          <w:color w:val="222222"/>
-          <w:sz w:val="21"/>
-          <w:szCs w:val="21"/>
-          <w:rtl/>
-        </w:rPr>
-        <w:t xml:space="preserve">طاولة علاجية قابلة للتعديل وكراسي مناسبة.</w:t>
-      </w:r>
-    </w:p>
-    <w:p>
-      <w:pPr>
-        <w:pStyle w:val="ListParagraph"/>
-        <w:numPr>
-          <w:ilvl w:val="0"/>
-          <w:numId w:val="2"/>
-        </w:numPr>
-        <w:bidi/>
-        <w:spacing w:after="60"/>
-        <w:jc w:val="right"/>
-      </w:pPr>
-      <w:r>
-        <w:rPr>
-          <w:rFonts w:ascii="Arial" w:cs="Arial" w:eastAsia="Arial" w:hAnsi="Arial"/>
-          <w:color w:val="222222"/>
-          <w:sz w:val="21"/>
-          <w:szCs w:val="21"/>
-          <w:rtl/>
-        </w:rPr>
-        <w:t xml:space="preserve">أدوات تموضع أساسية (وسائد إسفينية، أسطوانات دعم، مقاعد داعمة).</w:t>
-      </w:r>
-    </w:p>
-    <w:p>
-      <w:pPr>
-        <w:pStyle w:val="ListParagraph"/>
-        <w:numPr>
-          <w:ilvl w:val="0"/>
-          <w:numId w:val="2"/>
-        </w:numPr>
-        <w:bidi/>
-        <w:spacing w:after="60"/>
-        <w:jc w:val="right"/>
-      </w:pPr>
-      <w:r>
-        <w:rPr>
-          <w:rFonts w:ascii="Arial" w:cs="Arial" w:eastAsia="Arial" w:hAnsi="Arial"/>
-          <w:color w:val="222222"/>
-          <w:sz w:val="21"/>
-          <w:szCs w:val="21"/>
-          <w:rtl/>
-        </w:rPr>
-        <w:t xml:space="preserve">أدوات حسية (عناصر ذات ملمس مختلف، أدوات ذات وزن، أدوات تفريغ الطاقة، معجون علاجي).</w:t>
-      </w:r>
-    </w:p>
-    <w:p>
-      <w:pPr>
-        <w:pStyle w:val="ListParagraph"/>
-        <w:numPr>
-          <w:ilvl w:val="0"/>
-          <w:numId w:val="2"/>
-        </w:numPr>
-        <w:bidi/>
-        <w:spacing w:after="60"/>
-        <w:jc w:val="right"/>
-      </w:pPr>
-      <w:r>
-        <w:rPr>
-          <w:rFonts w:ascii="Arial" w:cs="Arial" w:eastAsia="Arial" w:hAnsi="Arial"/>
-          <w:color w:val="222222"/>
-          <w:sz w:val="21"/>
-          <w:szCs w:val="21"/>
-          <w:rtl/>
-        </w:rPr>
-        <w:t xml:space="preserve">أدوات المهارات الحركية الدقيقة (لوح أوتاد، ملاقط، بطاقات تشبيك، صلصال، مقص آمن).</w:t>
-      </w:r>
-    </w:p>
-    <w:p>
-      <w:pPr>
-        <w:pStyle w:val="ListParagraph"/>
-        <w:numPr>
-          <w:ilvl w:val="0"/>
-          <w:numId w:val="2"/>
-        </w:numPr>
-        <w:bidi/>
-        <w:spacing w:after="60"/>
-        <w:jc w:val="right"/>
-      </w:pPr>
-      <w:r>
-        <w:rPr>
-          <w:rFonts w:ascii="Arial" w:cs="Arial" w:eastAsia="Arial" w:hAnsi="Arial"/>
-          <w:color w:val="222222"/>
-          <w:sz w:val="21"/>
-          <w:szCs w:val="21"/>
-          <w:rtl/>
-        </w:rPr>
-        <w:t xml:space="preserve">أدوات المهارات الحركية الكبيرة (كرات، عارضة توازن، نفق، ترامبولين إن وُجد).</w:t>
-      </w:r>
-    </w:p>
-    <w:p>
-      <w:pPr>
-        <w:pStyle w:val="ListParagraph"/>
-        <w:numPr>
-          <w:ilvl w:val="0"/>
-          <w:numId w:val="2"/>
-        </w:numPr>
-        <w:bidi/>
-        <w:spacing w:after="60"/>
-        <w:jc w:val="right"/>
-      </w:pPr>
-      <w:r>
-        <w:rPr>
-          <w:rFonts w:ascii="Arial" w:cs="Arial" w:eastAsia="Arial" w:hAnsi="Arial"/>
-          <w:color w:val="222222"/>
-          <w:sz w:val="21"/>
-          <w:szCs w:val="21"/>
-          <w:rtl/>
-        </w:rPr>
-        <w:t xml:space="preserve">أدوات تدريب على أنشطة الحياة اليومية (لوح ارتداء ملابس، أدوات إطعام، لوح أزرار وسحّابات).</w:t>
-      </w:r>
-    </w:p>
-    <w:p>
-      <w:pPr>
-        <w:pStyle w:val="ListParagraph"/>
-        <w:numPr>
-          <w:ilvl w:val="0"/>
-          <w:numId w:val="2"/>
-        </w:numPr>
-        <w:bidi/>
-        <w:spacing w:after="60"/>
-        <w:jc w:val="right"/>
-      </w:pPr>
-      <w:r>
-        <w:rPr>
-          <w:rFonts w:ascii="Arial" w:cs="Arial" w:eastAsia="Arial" w:hAnsi="Arial"/>
-          <w:color w:val="222222"/>
-          <w:sz w:val="21"/>
-          <w:szCs w:val="21"/>
-          <w:rtl/>
-        </w:rPr>
-        <w:t xml:space="preserve">وسائل بصرية (بطاقات صور، جداول بصرية، لوحات تواصل).</w:t>
-      </w:r>
-    </w:p>
-    <w:p>
-      <w:pPr>
-        <w:pStyle w:val="ListParagraph"/>
-        <w:numPr>
-          <w:ilvl w:val="0"/>
-          <w:numId w:val="2"/>
-        </w:numPr>
-        <w:bidi/>
-        <w:spacing w:after="60"/>
-        <w:jc w:val="right"/>
-      </w:pPr>
-      <w:r>
-        <w:rPr>
-          <w:rFonts w:ascii="Arial" w:cs="Arial" w:eastAsia="Arial" w:hAnsi="Arial"/>
-          <w:color w:val="222222"/>
-          <w:sz w:val="21"/>
-          <w:szCs w:val="21"/>
-          <w:rtl/>
-        </w:rPr>
-        <w:t xml:space="preserve">نشرات مطبوعة وملف خاص بكل متدرب.</w:t>
-      </w:r>
-    </w:p>
-    <w:p>
-      <w:pPr>
-        <w:pStyle w:val="ListParagraph"/>
-        <w:numPr>
-          <w:ilvl w:val="0"/>
-          <w:numId w:val="2"/>
-        </w:numPr>
-        <w:bidi/>
-        <w:spacing w:after="60"/>
-        <w:jc w:val="right"/>
-      </w:pPr>
-      <w:r>
-        <w:rPr>
-          <w:rFonts w:ascii="Arial" w:cs="Arial" w:eastAsia="Arial" w:hAnsi="Arial"/>
-          <w:color w:val="222222"/>
-          <w:sz w:val="21"/>
-          <w:szCs w:val="21"/>
-          <w:rtl/>
-        </w:rPr>
-        <w:t xml:space="preserve">سجل حضور ونماذج تقييم.</w:t>
-      </w:r>
-    </w:p>
-    <w:p>
-      <w:pPr>
-        <w:keepNext/>
-        <w:bidi/>
-        <w:spacing w:after="100" w:before="200"/>
-        <w:jc w:val="right"/>
-      </w:pPr>
-      <w:r>
-        <w:rPr>
-          <w:rFonts w:ascii="Arial" w:cs="Arial" w:eastAsia="Arial" w:hAnsi="Arial"/>
-          <w:b/>
-          <w:bCs/>
-          <w:color w:val="1F4A47"/>
-          <w:sz w:val="22"/>
-          <w:szCs w:val="22"/>
-          <w:rtl/>
-        </w:rPr>
-        <w:t xml:space="preserve">ما يُطلب من مقدم الرعاية إحضاره:</w:t>
-      </w:r>
-    </w:p>
-    <w:p>
-      <w:pPr>
-        <w:pStyle w:val="ListParagraph"/>
-        <w:numPr>
-          <w:ilvl w:val="0"/>
-          <w:numId w:val="2"/>
-        </w:numPr>
-        <w:bidi/>
-        <w:spacing w:after="60"/>
-        <w:jc w:val="right"/>
-      </w:pPr>
-      <w:r>
-        <w:rPr>
-          <w:rFonts w:ascii="Arial" w:cs="Arial" w:eastAsia="Arial" w:hAnsi="Arial"/>
-          <w:color w:val="222222"/>
-          <w:sz w:val="21"/>
-          <w:szCs w:val="21"/>
-          <w:rtl/>
-        </w:rPr>
-        <w:t xml:space="preserve">دفتر وقلم لتدوين الملاحظات.</w:t>
-      </w:r>
-    </w:p>
-    <w:p>
-      <w:pPr>
-        <w:pStyle w:val="ListParagraph"/>
-        <w:numPr>
-          <w:ilvl w:val="0"/>
-          <w:numId w:val="2"/>
-        </w:numPr>
-        <w:bidi/>
-        <w:spacing w:after="60"/>
-        <w:jc w:val="right"/>
-      </w:pPr>
-      <w:r>
-        <w:rPr>
-          <w:rFonts w:ascii="Arial" w:cs="Arial" w:eastAsia="Arial" w:hAnsi="Arial"/>
-          <w:color w:val="222222"/>
-          <w:sz w:val="21"/>
-          <w:szCs w:val="21"/>
-          <w:rtl/>
-        </w:rPr>
-        <w:t xml:space="preserve">ملابس مريحة تناسب التدريب على الأرض.</w:t>
-      </w:r>
-    </w:p>
-    <w:p>
-      <w:pPr>
-        <w:pStyle w:val="ListParagraph"/>
-        <w:numPr>
-          <w:ilvl w:val="0"/>
-          <w:numId w:val="2"/>
-        </w:numPr>
-        <w:bidi/>
-        <w:spacing w:after="60"/>
-        <w:jc w:val="right"/>
-      </w:pPr>
-      <w:r>
-        <w:rPr>
-          <w:rFonts w:ascii="Arial" w:cs="Arial" w:eastAsia="Arial" w:hAnsi="Arial"/>
-          <w:color w:val="222222"/>
-          <w:sz w:val="21"/>
-          <w:szCs w:val="21"/>
-          <w:rtl/>
-        </w:rPr>
-        <w:t xml:space="preserve">البرنامج المنزلي الحالي لطفله أو ملاحظات العلاج السابقة، عند الحاجة.</w:t>
-      </w:r>
-    </w:p>
-    <w:p>
-      <w:pPr>
-        <w:pStyle w:val="Heading1"/>
-        <w:keepNext/>
-        <w:pBdr>
-          <w:bottom w:val="single" w:color="2E6B66" w:sz="6" w:space="6"/>
-        </w:pBdr>
-        <w:bidi/>
-        <w:spacing w:after="160" w:before="320"/>
-        <w:jc w:val="right"/>
-      </w:pPr>
-      <w:r>
-        <w:rPr>
-          <w:rFonts w:ascii="Arial" w:cs="Arial" w:eastAsia="Arial" w:hAnsi="Arial"/>
-          <w:b/>
-          <w:bCs/>
-          <w:color w:val="1F4A47"/>
-          <w:sz w:val="30"/>
-          <w:szCs w:val="30"/>
-          <w:rtl/>
-        </w:rPr>
-        <w:t xml:space="preserve">٨. شروط الحضور</w:t>
-      </w:r>
-    </w:p>
-    <w:p>
-      <w:pPr>
-        <w:pStyle w:val="ListParagraph"/>
-        <w:numPr>
-          <w:ilvl w:val="0"/>
-          <w:numId w:val="2"/>
-        </w:numPr>
-        <w:bidi/>
-        <w:spacing w:after="60"/>
-        <w:jc w:val="right"/>
-      </w:pPr>
-      <w:r>
-        <w:rPr>
-          <w:rFonts w:ascii="Arial" w:cs="Arial" w:eastAsia="Arial" w:hAnsi="Arial"/>
-          <w:color w:val="222222"/>
-          <w:sz w:val="21"/>
-          <w:szCs w:val="21"/>
-          <w:rtl/>
-        </w:rPr>
-        <w:t xml:space="preserve">يُشترط حضور 80% على الأقل من الجلسات (10 من أصل 12 جلسة) للحصول على الشهادة.</w:t>
-      </w:r>
-    </w:p>
-    <w:p>
-      <w:pPr>
-        <w:pStyle w:val="ListParagraph"/>
-        <w:numPr>
-          <w:ilvl w:val="0"/>
-          <w:numId w:val="2"/>
-        </w:numPr>
-        <w:bidi/>
-        <w:spacing w:after="60"/>
-        <w:jc w:val="right"/>
-      </w:pPr>
-      <w:r>
-        <w:rPr>
-          <w:rFonts w:ascii="Arial" w:cs="Arial" w:eastAsia="Arial" w:hAnsi="Arial"/>
-          <w:color w:val="222222"/>
-          <w:sz w:val="21"/>
-          <w:szCs w:val="21"/>
-          <w:rtl/>
-        </w:rPr>
-        <w:t xml:space="preserve">تُعوَّض الجلسات الفائتة عبر جلسة تعويضية قصيرة فردية أو مواد مسجّلة، حسب سياسة العيادة.</w:t>
-      </w:r>
-    </w:p>
-    <w:p>
-      <w:pPr>
-        <w:pStyle w:val="ListParagraph"/>
-        <w:numPr>
-          <w:ilvl w:val="0"/>
-          <w:numId w:val="2"/>
-        </w:numPr>
-        <w:bidi/>
-        <w:spacing w:after="60"/>
-        <w:jc w:val="right"/>
-      </w:pPr>
-      <w:r>
-        <w:rPr>
-          <w:rFonts w:ascii="Arial" w:cs="Arial" w:eastAsia="Arial" w:hAnsi="Arial"/>
-          <w:color w:val="222222"/>
-          <w:sz w:val="21"/>
-          <w:szCs w:val="21"/>
-          <w:rtl/>
-        </w:rPr>
-        <w:t xml:space="preserve">الالتزام بالمواعيد مهم؛ والتأخر أكثر من 15 دقيقة يُحتسب غيابًا جزئيًا.</w:t>
-      </w:r>
-    </w:p>
-    <w:p>
-      <w:pPr>
-        <w:pStyle w:val="ListParagraph"/>
-        <w:numPr>
-          <w:ilvl w:val="0"/>
-          <w:numId w:val="2"/>
-        </w:numPr>
-        <w:bidi/>
-        <w:spacing w:after="60"/>
-        <w:jc w:val="right"/>
-      </w:pPr>
-      <w:r>
-        <w:rPr>
-          <w:rFonts w:ascii="Arial" w:cs="Arial" w:eastAsia="Arial" w:hAnsi="Arial"/>
-          <w:color w:val="222222"/>
-          <w:sz w:val="21"/>
-          <w:szCs w:val="21"/>
-          <w:rtl/>
-        </w:rPr>
-        <w:t xml:space="preserve">في حال تعذّر إكمال البرنامج بالكامل، يمكن للمشارك طلب خطاب يوضح عدد الجلسات التي حضرها.</w:t>
-      </w:r>
-    </w:p>
-    <w:p>
-      <w:pPr>
-        <w:pStyle w:val="Heading1"/>
-        <w:keepNext/>
-        <w:pBdr>
-          <w:bottom w:val="single" w:color="2E6B66" w:sz="6" w:space="6"/>
-        </w:pBdr>
-        <w:bidi/>
-        <w:spacing w:after="160" w:before="320"/>
-        <w:jc w:val="right"/>
-      </w:pPr>
-      <w:r>
-        <w:rPr>
-          <w:rFonts w:ascii="Arial" w:cs="Arial" w:eastAsia="Arial" w:hAnsi="Arial"/>
-          <w:b/>
-          <w:bCs/>
-          <w:color w:val="1F4A47"/>
-          <w:sz w:val="30"/>
-          <w:szCs w:val="30"/>
-          <w:rtl/>
-        </w:rPr>
-        <w:t xml:space="preserve">٩. طرق التقييم</w:t>
-      </w:r>
-    </w:p>
-    <w:p>
-      <w:pPr>
-        <w:pStyle w:val="ListParagraph"/>
-        <w:numPr>
-          <w:ilvl w:val="0"/>
-          <w:numId w:val="2"/>
-        </w:numPr>
-        <w:bidi/>
-        <w:spacing w:after="60"/>
-        <w:jc w:val="right"/>
-      </w:pPr>
-      <w:r>
-        <w:rPr>
-          <w:rFonts w:ascii="Arial" w:cs="Arial" w:eastAsia="Arial" w:hAnsi="Arial"/>
-          <w:color w:val="222222"/>
-          <w:sz w:val="21"/>
-          <w:szCs w:val="21"/>
-          <w:rtl/>
-        </w:rPr>
-        <w:t xml:space="preserve">متابعة عملية أسبوعية قصيرة، يلاحظ خلالها المعالج تطبيق مقدم الرعاية للمهارة المشروحة في ذلك الأسبوع.</w:t>
-      </w:r>
-    </w:p>
-    <w:p>
-      <w:pPr>
-        <w:pStyle w:val="ListParagraph"/>
-        <w:numPr>
-          <w:ilvl w:val="0"/>
-          <w:numId w:val="2"/>
-        </w:numPr>
-        <w:bidi/>
-        <w:spacing w:after="60"/>
-        <w:jc w:val="right"/>
-      </w:pPr>
-      <w:r>
-        <w:rPr>
-          <w:rFonts w:ascii="Arial" w:cs="Arial" w:eastAsia="Arial" w:hAnsi="Arial"/>
-          <w:color w:val="222222"/>
-          <w:sz w:val="21"/>
-          <w:szCs w:val="21"/>
-          <w:rtl/>
-        </w:rPr>
-        <w:t xml:space="preserve">استبيان بسيط قبل بدء البرنامج وبعد انتهائه لقياس مستوى المعرفة والثقة لدى المشارك.</w:t>
-      </w:r>
-    </w:p>
-    <w:p>
-      <w:pPr>
-        <w:pStyle w:val="ListParagraph"/>
-        <w:numPr>
-          <w:ilvl w:val="0"/>
-          <w:numId w:val="2"/>
-        </w:numPr>
-        <w:bidi/>
-        <w:spacing w:after="60"/>
-        <w:jc w:val="right"/>
-      </w:pPr>
-      <w:r>
-        <w:rPr>
-          <w:rFonts w:ascii="Arial" w:cs="Arial" w:eastAsia="Arial" w:hAnsi="Arial"/>
-          <w:color w:val="222222"/>
-          <w:sz w:val="21"/>
-          <w:szCs w:val="21"/>
-          <w:rtl/>
-        </w:rPr>
-        <w:t xml:space="preserve">مراجعة الواجبات المنزلية المقدَّمة أسبوعيًا.</w:t>
-      </w:r>
-    </w:p>
-    <w:p>
-      <w:pPr>
-        <w:pStyle w:val="ListParagraph"/>
-        <w:numPr>
-          <w:ilvl w:val="0"/>
-          <w:numId w:val="2"/>
-        </w:numPr>
-        <w:bidi/>
-        <w:spacing w:after="60"/>
-        <w:jc w:val="right"/>
-      </w:pPr>
-      <w:r>
-        <w:rPr>
-          <w:rFonts w:ascii="Arial" w:cs="Arial" w:eastAsia="Arial" w:hAnsi="Arial"/>
-          <w:color w:val="222222"/>
-          <w:sz w:val="21"/>
-          <w:szCs w:val="21"/>
-          <w:rtl/>
-        </w:rPr>
-        <w:t xml:space="preserve">تقييم عملي ختامي في الأسبوع الثاني عشر، يُظهر فيه المشارك مجموعة من المهارات الأساسية.</w:t>
-      </w:r>
-    </w:p>
-    <w:p>
-      <w:pPr>
-        <w:pStyle w:val="ListParagraph"/>
-        <w:numPr>
-          <w:ilvl w:val="0"/>
-          <w:numId w:val="2"/>
-        </w:numPr>
-        <w:bidi/>
-        <w:spacing w:after="60"/>
-        <w:jc w:val="right"/>
-      </w:pPr>
-      <w:r>
-        <w:rPr>
-          <w:rFonts w:ascii="Arial" w:cs="Arial" w:eastAsia="Arial" w:hAnsi="Arial"/>
-          <w:color w:val="222222"/>
-          <w:sz w:val="21"/>
-          <w:szCs w:val="21"/>
-          <w:rtl/>
-        </w:rPr>
-        <w:t xml:space="preserve">ملاحظات غير رسمية مستمرة طوال فترة البرنامج.</w:t>
-      </w:r>
-    </w:p>
-    <w:p>
-      <w:pPr>
-        <w:pStyle w:val="Heading1"/>
-        <w:keepNext/>
-        <w:pBdr>
-          <w:bottom w:val="single" w:color="2E6B66" w:sz="6" w:space="6"/>
-        </w:pBdr>
-        <w:bidi/>
-        <w:spacing w:after="160" w:before="320"/>
-        <w:jc w:val="right"/>
-      </w:pPr>
-      <w:r>
-        <w:rPr>
-          <w:rFonts w:ascii="Arial" w:cs="Arial" w:eastAsia="Arial" w:hAnsi="Arial"/>
-          <w:b/>
-          <w:bCs/>
-          <w:color w:val="1F4A47"/>
-          <w:sz w:val="30"/>
-          <w:szCs w:val="30"/>
-          <w:rtl/>
-        </w:rPr>
-        <w:t xml:space="preserve">١٠. شروط الحصول على الشهادة</w:t>
+        <w:t xml:space="preserve">٧. الخاتمة</w:t>
       </w:r>
     </w:p>
     <w:p>
@@ -1863,119 +1732,7 @@
           <w:szCs w:val="21"/>
           <w:rtl/>
         </w:rPr>
-        <w:t xml:space="preserve">للحصول على شهادة إتمام برنامج تدريب مقدمي الرعاية من عيادة كالم، يجب على المشارك:</w:t>
-      </w:r>
-    </w:p>
-    <w:p>
-      <w:pPr>
-        <w:pStyle w:val="ListParagraph"/>
-        <w:numPr>
-          <w:ilvl w:val="0"/>
-          <w:numId w:val="2"/>
-        </w:numPr>
-        <w:bidi/>
-        <w:spacing w:after="60"/>
-        <w:jc w:val="right"/>
-      </w:pPr>
-      <w:r>
-        <w:rPr>
-          <w:rFonts w:ascii="Arial" w:cs="Arial" w:eastAsia="Arial" w:hAnsi="Arial"/>
-          <w:color w:val="222222"/>
-          <w:sz w:val="21"/>
-          <w:szCs w:val="21"/>
-          <w:rtl/>
-        </w:rPr>
-        <w:t xml:space="preserve">حضور 80% على الأقل من الجلسات (10 من أصل 12).</w:t>
-      </w:r>
-    </w:p>
-    <w:p>
-      <w:pPr>
-        <w:pStyle w:val="ListParagraph"/>
-        <w:numPr>
-          <w:ilvl w:val="0"/>
-          <w:numId w:val="2"/>
-        </w:numPr>
-        <w:bidi/>
-        <w:spacing w:after="60"/>
-        <w:jc w:val="right"/>
-      </w:pPr>
-      <w:r>
-        <w:rPr>
-          <w:rFonts w:ascii="Arial" w:cs="Arial" w:eastAsia="Arial" w:hAnsi="Arial"/>
-          <w:color w:val="222222"/>
-          <w:sz w:val="21"/>
-          <w:szCs w:val="21"/>
-          <w:rtl/>
-        </w:rPr>
-        <w:t xml:space="preserve">إنجاز التقييم العملي الختامي في الأسبوع الثاني عشر.</w:t>
-      </w:r>
-    </w:p>
-    <w:p>
-      <w:pPr>
-        <w:pStyle w:val="ListParagraph"/>
-        <w:numPr>
-          <w:ilvl w:val="0"/>
-          <w:numId w:val="2"/>
-        </w:numPr>
-        <w:bidi/>
-        <w:spacing w:after="60"/>
-        <w:jc w:val="right"/>
-      </w:pPr>
-      <w:r>
-        <w:rPr>
-          <w:rFonts w:ascii="Arial" w:cs="Arial" w:eastAsia="Arial" w:hAnsi="Arial"/>
-          <w:color w:val="222222"/>
-          <w:sz w:val="21"/>
-          <w:szCs w:val="21"/>
-          <w:rtl/>
-        </w:rPr>
-        <w:t xml:space="preserve">تسليم 8 واجبات منزلية على الأقل من أصل 12.</w:t>
-      </w:r>
-    </w:p>
-    <w:p>
-      <w:pPr>
-        <w:pStyle w:val="ListParagraph"/>
-        <w:numPr>
-          <w:ilvl w:val="0"/>
-          <w:numId w:val="2"/>
-        </w:numPr>
-        <w:bidi/>
-        <w:spacing w:after="60"/>
-        <w:jc w:val="right"/>
-      </w:pPr>
-      <w:r>
-        <w:rPr>
-          <w:rFonts w:ascii="Arial" w:cs="Arial" w:eastAsia="Arial" w:hAnsi="Arial"/>
-          <w:color w:val="222222"/>
-          <w:sz w:val="21"/>
-          <w:szCs w:val="21"/>
-          <w:rtl/>
-        </w:rPr>
-        <w:t xml:space="preserve">إظهار أداء مقبول في المتابعات العملية الأسبوعية، وفق تقييم الأخصائية المشرفة.</w:t>
-      </w:r>
-    </w:p>
-    <w:p>
-      <w:pPr>
-        <w:pStyle w:val="Heading1"/>
-        <w:keepNext/>
-        <w:pBdr>
-          <w:bottom w:val="single" w:color="2E6B66" w:sz="6" w:space="6"/>
-        </w:pBdr>
-        <w:bidi/>
-        <w:spacing w:after="160" w:before="320"/>
-        <w:jc w:val="right"/>
-      </w:pPr>
-      <w:r>
-        <w:rPr>
-          <w:rFonts w:ascii="Arial" w:cs="Arial" w:eastAsia="Arial" w:hAnsi="Arial"/>
-          <w:b/>
-          <w:bCs/>
-          <w:color w:val="1F4A47"/>
-          <w:sz w:val="30"/>
-          <w:szCs w:val="30"/>
-          <w:rtl/>
-        </w:rPr>
-        <w:t xml:space="preserve">١١. الخاتمة</w:t>
+        <w:t xml:space="preserve">أؤمن أن مقدم الرعاية هو الحلقة الأهم في رحلة تأهيل أي طفل. فمهما كانت كفاءة الفريق العلاجي، يبقى التقدم الحقيقي مرهونًا باللحظات الصغيرة المتكررة داخل المنزل: أثناء الطعام، وارتداء الملابس، واللعب، والروتين اليومي. وهذا البرنامج هو محاولتي لتزويد مقدمي الرعاية بالأدوات العملية والثقة التي يحتاجونها في تلك اللحظات بالتحديد، من خلال أسلوب تدريبي عملي ومنظم يقدّمه فريق عيادة كالم متعدد التخصصات بأكمله.</w:t>
       </w:r>
     </w:p>
     <w:p>
@@ -1992,24 +1749,7 @@
           <w:szCs w:val="21"/>
           <w:rtl/>
         </w:rPr>
-        <w:t xml:space="preserve">أؤمن أن مقدم الرعاية هو الحلقة الأهم في رحلة تأهيل أي طفل. فمهما كانت كفاءة الفريق العلاجي، يبقى التقدم الحقيقي مرهونًا باللحظات الصغيرة المتكررة داخل المنزل: أثناء الطعام، وارتداء الملابس، واللعب، والروتين اليومي. وهذا البرنامج هو محاولتي لتزويد مقدمي الرعاية بالأدوات العملية والثقة التي يحتاجونها في تلك اللحظات بالتحديد.</w:t>
-      </w:r>
-    </w:p>
-    <w:p>
-      <w:pPr>
-        <w:bidi/>
-        <w:spacing w:after="160" w:line="300"/>
-        <w:jc w:val="both"/>
-      </w:pPr>
-      <w:r>
-        <w:rPr>
-          <w:rFonts w:ascii="Arial" w:cs="Arial" w:eastAsia="Arial" w:hAnsi="Arial"/>
-          <w:color w:val="222222"/>
-          <w:sz w:val="21"/>
-          <w:szCs w:val="21"/>
-          <w:rtl/>
-        </w:rPr>
-        <w:t xml:space="preserve">أتقدم بهذا المقترح لتنفيذ البرنامج داخل عيادة كالم، انطلاقًا من التزام العيادة بتقديم رعاية متمحورة حول الأسرة وقائمة على العمل الجماعي متعدد التخصصات. ويسعدني مناقشة التوقيت وحجم المجموعات وأي تعديلات لازمة لملاءمة البرنامج مع جدول العيادة.</w:t>
+        <w:t xml:space="preserve">أتقدم بهذا المقترح لتنفيذ البرنامج داخل عيادة كالم، انطلاقًا من التزام العيادة بتقديم رعاية متمحورة حول الأسرة وقائمة على العمل الجماعي متعدد التخصصات. ويسعدني مناقشة الجدول الزمني وحجم المجموعات وأي تعديلات لازمة لملاءمة البرنامج مع سير العمل اليومي في العيادة.</w:t>
       </w:r>
     </w:p>
     <w:p>
@@ -2032,7 +1772,7 @@
           <w:szCs w:val="21"/>
           <w:rtl/>
         </w:rPr>
-        <w:t xml:space="preserve">ساجا الزيود</w:t>
+        <w:t xml:space="preserve">سجى الزيود (Saja Al-Zyoud)</w:t>
       </w:r>
     </w:p>
     <w:p>
@@ -2096,7 +1836,7 @@
           <w:szCs w:val="21"/>
           <w:rtl/>
         </w:rPr>
-        <w:t xml:space="preserve">يوضّح الجدول التالي البرنامج الكامل على مدار 12 أسبوعًا، بموضوع أساسي واحد لكل أسبوع، بدءًا من الفهم الأساسي وصولًا إلى مهارات رعاية عملية وتطبيقية.</w:t>
+        <w:t xml:space="preserve">يوضّح الجدول التالي البرنامج الكامل على مدار 12 أسبوعًا، بموضوع أساسي واحد لكل أسبوع، يُقدَّم على مدار 5 أيام تدريب أسبوعيًا بواقع 5 ساعات يوميًا؛ ساعتان بقيادة أخصائية العلاج الوظيفي وثلاث ساعات مع الفريق متعدد التخصصات. وينتقل البرنامج تدريجيًا من الفهم الأساسي إلى مهارات رعاية عملية وتطبيقية.</w:t>
       </w:r>
     </w:p>
     <w:p>
@@ -2385,7 +2125,7 @@
                 <w:szCs w:val="19"/>
                 <w:rtl/>
               </w:rPr>
-              <w:t xml:space="preserve">جلسة "تعرّف على فريقك" للقاء أخصائيي العلاج الوظيفي والطبيعي والنطق.</w:t>
+              <w:t xml:space="preserve">جلسة "تعرّف على فريقك" للقاء أخصائيي العلاج الوظيفي والطبيعي والنطق والأخصائي النفسي.</w:t>
             </w:r>
           </w:p>
         </w:tc>
@@ -9180,7 +8920,7 @@
                 <w:szCs w:val="19"/>
                 <w:rtl/>
               </w:rPr>
-              <w:t xml:space="preserve">ختام البرنامج وتوزيع الشهادات.</w:t>
+              <w:t xml:space="preserve">ختام البرنامج ومناقشة ختامية.</w:t>
             </w:r>
           </w:p>
         </w:tc>

</xml_diff>